<commit_message>
Refactor all table builders to use centralized gray color constants
Co-authored-by: DanEl23 <102105717+DanEl23@users.noreply.github.com>
</commit_message>
<xml_diff>
--- a/teste_4_colunas.docx
+++ b/teste_4_colunas.docx
@@ -27,9 +27,12 @@
     <w:tbl>
       <w:tblPr>
         <w:tblW w:type="auto" w:w="0"/>
-        <w:jc w:val="center"/>
+        <w:jc w:val="left"/>
+        <w:tblLayout w:type="fixed"/>
         <w:tblLook w:firstColumn="1" w:firstRow="1" w:lastColumn="0" w:lastRow="0" w:noHBand="0" w:noVBand="1" w:val="04A0"/>
-        <w:tblW w:w="9263" w:type="dxa"/>
+        <w:tblW w:w="10337" w:type="dxa"/>
+        <w:tblLayout w:type="fixed"/>
+        <w:tblInd w:w="-675" w:type="dxa"/>
       </w:tblPr>
       <w:tblGrid>
         <w:gridCol w:w="2160"/>
@@ -45,7 +48,7 @@
         <w:tc>
           <w:tcPr>
             <w:tcW w:type="dxa" w:w="2160"/>
-            <w:tcW w:w="3759" w:type="dxa"/>
+            <w:tcW w:w="4184" w:type="dxa"/>
             <w:tcBorders>
               <w:top w:val="single" w:sz="4" w:color="000000"/>
               <w:left w:val="single" w:sz="4" w:color="000000"/>
@@ -74,7 +77,7 @@
         <w:tc>
           <w:tcPr>
             <w:tcW w:type="dxa" w:w="2160"/>
-            <w:tcW w:w="2353" w:type="dxa"/>
+            <w:tcW w:w="2680" w:type="dxa"/>
             <w:tcBorders>
               <w:top w:val="single" w:sz="4" w:color="000000"/>
               <w:left w:val="single" w:sz="4" w:color="000000"/>
@@ -103,7 +106,7 @@
         <w:tc>
           <w:tcPr>
             <w:tcW w:type="dxa" w:w="2160"/>
-            <w:tcW w:w="2353" w:type="dxa"/>
+            <w:tcW w:w="2680" w:type="dxa"/>
             <w:tcBorders>
               <w:top w:val="single" w:sz="4" w:color="000000"/>
               <w:left w:val="single" w:sz="4" w:color="000000"/>
@@ -132,7 +135,7 @@
         <w:tc>
           <w:tcPr>
             <w:tcW w:type="dxa" w:w="2160"/>
-            <w:tcW w:w="798" w:type="dxa"/>
+            <w:tcW w:w="793" w:type="dxa"/>
             <w:tcBorders>
               <w:top w:val="single" w:sz="4" w:color="000000"/>
               <w:left w:val="single" w:sz="4" w:color="000000"/>
@@ -166,7 +169,7 @@
         <w:tc>
           <w:tcPr>
             <w:tcW w:type="dxa" w:w="2160"/>
-            <w:tcW w:w="3759" w:type="dxa"/>
+            <w:tcW w:w="4184" w:type="dxa"/>
             <w:tcBorders>
               <w:top w:val="single" w:sz="4" w:color="000000"/>
               <w:left w:val="single" w:sz="4" w:color="000000"/>
@@ -196,7 +199,7 @@
         <w:tc>
           <w:tcPr>
             <w:tcW w:type="dxa" w:w="2160"/>
-            <w:tcW w:w="2353" w:type="dxa"/>
+            <w:tcW w:w="2680" w:type="dxa"/>
             <w:tcBorders>
               <w:top w:val="single" w:sz="4" w:color="000000"/>
               <w:left w:val="single" w:sz="4" w:color="000000"/>
@@ -225,7 +228,7 @@
         <w:tc>
           <w:tcPr>
             <w:tcW w:type="dxa" w:w="2160"/>
-            <w:tcW w:w="2353" w:type="dxa"/>
+            <w:tcW w:w="2680" w:type="dxa"/>
             <w:tcBorders>
               <w:top w:val="single" w:sz="4" w:color="000000"/>
               <w:left w:val="single" w:sz="4" w:color="000000"/>
@@ -254,7 +257,7 @@
         <w:tc>
           <w:tcPr>
             <w:tcW w:type="dxa" w:w="2160"/>
-            <w:tcW w:w="798" w:type="dxa"/>
+            <w:tcW w:w="793" w:type="dxa"/>
             <w:tcBorders>
               <w:top w:val="single" w:sz="4" w:color="000000"/>
               <w:left w:val="single" w:sz="4" w:color="000000"/>
@@ -288,7 +291,7 @@
         <w:tc>
           <w:tcPr>
             <w:tcW w:type="dxa" w:w="2160"/>
-            <w:tcW w:w="3759" w:type="dxa"/>
+            <w:tcW w:w="4184" w:type="dxa"/>
             <w:tcBorders>
               <w:top w:val="single" w:sz="4" w:color="000000"/>
               <w:left w:val="single" w:sz="4" w:color="000000"/>
@@ -318,7 +321,7 @@
         <w:tc>
           <w:tcPr>
             <w:tcW w:type="dxa" w:w="2160"/>
-            <w:tcW w:w="2353" w:type="dxa"/>
+            <w:tcW w:w="2680" w:type="dxa"/>
             <w:tcBorders>
               <w:top w:val="single" w:sz="4" w:color="000000"/>
               <w:left w:val="single" w:sz="4" w:color="000000"/>
@@ -347,7 +350,7 @@
         <w:tc>
           <w:tcPr>
             <w:tcW w:type="dxa" w:w="2160"/>
-            <w:tcW w:w="2353" w:type="dxa"/>
+            <w:tcW w:w="2680" w:type="dxa"/>
             <w:tcBorders>
               <w:top w:val="single" w:sz="4" w:color="000000"/>
               <w:left w:val="single" w:sz="4" w:color="000000"/>
@@ -376,7 +379,7 @@
         <w:tc>
           <w:tcPr>
             <w:tcW w:type="dxa" w:w="2160"/>
-            <w:tcW w:w="798" w:type="dxa"/>
+            <w:tcW w:w="793" w:type="dxa"/>
             <w:tcBorders>
               <w:top w:val="single" w:sz="4" w:color="000000"/>
               <w:left w:val="single" w:sz="4" w:color="000000"/>
@@ -410,7 +413,7 @@
         <w:tc>
           <w:tcPr>
             <w:tcW w:type="dxa" w:w="2160"/>
-            <w:tcW w:w="3759" w:type="dxa"/>
+            <w:tcW w:w="4184" w:type="dxa"/>
             <w:tcBorders>
               <w:top w:val="single" w:sz="4" w:color="000000"/>
               <w:left w:val="single" w:sz="4" w:color="000000"/>
@@ -440,7 +443,7 @@
         <w:tc>
           <w:tcPr>
             <w:tcW w:type="dxa" w:w="2160"/>
-            <w:tcW w:w="2353" w:type="dxa"/>
+            <w:tcW w:w="2680" w:type="dxa"/>
             <w:tcBorders>
               <w:top w:val="single" w:sz="4" w:color="000000"/>
               <w:left w:val="single" w:sz="4" w:color="000000"/>
@@ -469,7 +472,7 @@
         <w:tc>
           <w:tcPr>
             <w:tcW w:type="dxa" w:w="2160"/>
-            <w:tcW w:w="2353" w:type="dxa"/>
+            <w:tcW w:w="2680" w:type="dxa"/>
             <w:tcBorders>
               <w:top w:val="single" w:sz="4" w:color="000000"/>
               <w:left w:val="single" w:sz="4" w:color="000000"/>
@@ -498,7 +501,7 @@
         <w:tc>
           <w:tcPr>
             <w:tcW w:type="dxa" w:w="2160"/>
-            <w:tcW w:w="798" w:type="dxa"/>
+            <w:tcW w:w="793" w:type="dxa"/>
             <w:tcBorders>
               <w:top w:val="single" w:sz="4" w:color="000000"/>
               <w:left w:val="single" w:sz="4" w:color="000000"/>
@@ -532,7 +535,7 @@
         <w:tc>
           <w:tcPr>
             <w:tcW w:type="dxa" w:w="2160"/>
-            <w:tcW w:w="3759" w:type="dxa"/>
+            <w:tcW w:w="4184" w:type="dxa"/>
             <w:tcBorders>
               <w:top w:val="single" w:sz="4" w:color="000000"/>
               <w:left w:val="single" w:sz="4" w:color="000000"/>
@@ -562,7 +565,7 @@
         <w:tc>
           <w:tcPr>
             <w:tcW w:type="dxa" w:w="2160"/>
-            <w:tcW w:w="2353" w:type="dxa"/>
+            <w:tcW w:w="2680" w:type="dxa"/>
             <w:tcBorders>
               <w:top w:val="single" w:sz="4" w:color="000000"/>
               <w:left w:val="single" w:sz="4" w:color="000000"/>
@@ -591,7 +594,7 @@
         <w:tc>
           <w:tcPr>
             <w:tcW w:type="dxa" w:w="2160"/>
-            <w:tcW w:w="2353" w:type="dxa"/>
+            <w:tcW w:w="2680" w:type="dxa"/>
             <w:tcBorders>
               <w:top w:val="single" w:sz="4" w:color="000000"/>
               <w:left w:val="single" w:sz="4" w:color="000000"/>
@@ -620,7 +623,7 @@
         <w:tc>
           <w:tcPr>
             <w:tcW w:type="dxa" w:w="2160"/>
-            <w:tcW w:w="798" w:type="dxa"/>
+            <w:tcW w:w="793" w:type="dxa"/>
             <w:tcBorders>
               <w:top w:val="single" w:sz="4" w:color="000000"/>
               <w:left w:val="single" w:sz="4" w:color="000000"/>
@@ -654,7 +657,7 @@
         <w:tc>
           <w:tcPr>
             <w:tcW w:type="dxa" w:w="2160"/>
-            <w:tcW w:w="3759" w:type="dxa"/>
+            <w:tcW w:w="4184" w:type="dxa"/>
             <w:tcBorders>
               <w:top w:val="single" w:sz="4" w:color="000000"/>
               <w:left w:val="single" w:sz="4" w:color="000000"/>
@@ -684,7 +687,7 @@
         <w:tc>
           <w:tcPr>
             <w:tcW w:type="dxa" w:w="2160"/>
-            <w:tcW w:w="2353" w:type="dxa"/>
+            <w:tcW w:w="2680" w:type="dxa"/>
             <w:tcBorders>
               <w:top w:val="single" w:sz="4" w:color="000000"/>
               <w:left w:val="single" w:sz="4" w:color="000000"/>
@@ -713,7 +716,7 @@
         <w:tc>
           <w:tcPr>
             <w:tcW w:type="dxa" w:w="2160"/>
-            <w:tcW w:w="2353" w:type="dxa"/>
+            <w:tcW w:w="2680" w:type="dxa"/>
             <w:tcBorders>
               <w:top w:val="single" w:sz="4" w:color="000000"/>
               <w:left w:val="single" w:sz="4" w:color="000000"/>
@@ -742,7 +745,7 @@
         <w:tc>
           <w:tcPr>
             <w:tcW w:type="dxa" w:w="2160"/>
-            <w:tcW w:w="798" w:type="dxa"/>
+            <w:tcW w:w="793" w:type="dxa"/>
             <w:tcBorders>
               <w:top w:val="single" w:sz="4" w:color="000000"/>
               <w:left w:val="single" w:sz="4" w:color="000000"/>

</xml_diff>